<commit_message>
Finalize submission files and DOI metadata
</commit_message>
<xml_diff>
--- a/manuscript/Limits_of_Task_Set_Reduction_EMSE_submission.docx
+++ b/manuscript/Limits_of_Task_Set_Reduction_EMSE_submission.docx
@@ -449,7 +449,7 @@
         <w:rPr>
           <w:color w:val="000000"/>
         </w:rPr>
-        <w:t>Accordingly, this study separates scholarly citations from reproduction identifiers. Dataset papers, software repositories, and archived releases are cited as research objects. Commit identifiers and SHA-256 digests identify exact bytes and versions, but they are recorded in a reproduction manifest rather than treated as substitutes for references. A persistent archive and version-specific identifier are required for the released replication package.</w:t>
+        <w:t>Accordingly, this study separates scholarly citations from reproduction identifiers. Dataset papers, software repositories, and archived releases are cited as research objects. Commit identifiers and SHA-256 digests identify exact bytes and versions, but they are recorded in a reproduction manifest rather than treated as substitutes for references. A persistent archive and version-specific identifier are provided for the released replication package (Cui et al. 2026).</w:t>
       </w:r>
     </w:p>
     <w:p>
@@ -2187,26 +2187,6 @@
           <w:color w:val="000000"/>
         </w:rPr>
         <w:t>This study was not externally registered. An initial analysis examined the 2025 open-submission outcomes, so that panel is treated as developmental. The reliability thresholds were fixed before the two-panel analysis. Inspection of the resulting non-monotone budget paths revealed that the initial aggregation implementation incorrectly assumed monotone pass/fail status; the aggregation was corrected to evaluate each exact budget across all required cells. The harmonized bootstrap, raw-deviation band, standardized max-t bands, and coupling sensitivity were specified subsequently and are reported as post hoc robustness analyses. This sequence separates the fixed thresholds from the corrected aggregation and later sensitivity analyses.</w:t>
-      </w:r>
-    </w:p>
-    <w:p>
-      <w:pPr>
-        <w:pStyle w:val="Heading2"/>
-      </w:pPr>
-      <w:r>
-        <w:rPr>
-          <w:color w:val="000000"/>
-        </w:rPr>
-        <w:t>4.9 Use of generative AI</w:t>
-      </w:r>
-    </w:p>
-    <w:p>
-      <w:pPr/>
-      <w:r>
-        <w:rPr>
-          <w:color w:val="000000"/>
-        </w:rPr>
-        <w:t>OpenAI Codex assisted with implementing analysis code, checking calculations, and drafting and copyediting the manuscript. The human authors verified the code, results, citations, claims, and final text and remain accountable for the work; the system is not an author.</w:t>
       </w:r>
     </w:p>
     <w:p>
@@ -9206,13 +9186,13 @@
     </w:p>
     <w:p>
       <w:pPr>
-        <w:pStyle w:val="Heading1"/>
+        <w:pStyle w:val="Heading2"/>
       </w:pPr>
       <w:r>
         <w:rPr>
           <w:color w:val="000000"/>
         </w:rPr>
-        <w:t>9 Conclusion</w:t>
+        <w:t>8.1 Data availability</w:t>
       </w:r>
     </w:p>
     <w:p>
@@ -9221,7 +9201,45 @@
         <w:rPr>
           <w:color w:val="000000"/>
         </w:rPr>
-        <w:t>Task-set reduction for a coding-agent leaderboard must be evaluated as a future-ranking problem. In two temporal SWE-bench Verified panels, budgets that looked sufficient in a developmental cohort weakened under later standardized systems and related-system sensitivity. Under the primary and strict policies, uniform random, repository-stratified random, and entropy required all 500 tasks; the temporal-core procedure required 475. Under a common uncertainty definition with a standardized four-cell joint max-t band, the same 500/500/500/475 budgets remain. An unstandardized raw-deviation band instead forces all four to 500, demonstrating that the scaling and family of the band are part of the conclusion. Fixed selection and alternative cluster definitions further showed that neither task identity nor threshold crossing is invariant to the evaluation policy.</w:t>
+        <w:t xml:space="preserve">The study uses public SWE-bench Verified identifiers, outcome files, and leaderboard metadata pinned by commit and URL in </w:t>
+      </w:r>
+      <w:r>
+        <w:rPr>
+          <w:rFonts w:ascii="Courier New" w:hAnsi="Courier New"/>
+          <w:color w:val="000000"/>
+          <w:sz w:val="18"/>
+        </w:rPr>
+        <w:t>source_manifest.json</w:t>
+      </w:r>
+      <w:r>
+        <w:rPr>
+          <w:color w:val="000000"/>
+        </w:rPr>
+        <w:t xml:space="preserve"> (Jimenez et al. 2024; OpenAI 2024; SWE-bench Team 2026a, 2026b). The upstream binary outcome matrices are recollected by the scripts and are not redistributed. Generated aggregate and sensitivity tables contain no personal or private data. The version 1.0.0 replication package, including the generated outputs and Online Resources, is archived at Zenodo under </w:t>
+      </w:r>
+      <w:r>
+        <w:rPr>
+          <w:color w:val="000000"/>
+          <w:u w:val="single"/>
+        </w:rPr>
+        <w:t>https://doi.org/10.5281/zenodo.22189000</w:t>
+      </w:r>
+      <w:r>
+        <w:rPr>
+          <w:color w:val="000000"/>
+        </w:rPr>
+        <w:t xml:space="preserve"> (Cui et al. 2026).</w:t>
+      </w:r>
+    </w:p>
+    <w:p>
+      <w:pPr>
+        <w:pStyle w:val="Heading2"/>
+      </w:pPr>
+      <w:r>
+        <w:rPr>
+          <w:color w:val="000000"/>
+        </w:rPr>
+        <w:t>8.2 Code availability</w:t>
       </w:r>
     </w:p>
     <w:p>
@@ -9230,7 +9248,60 @@
         <w:rPr>
           <w:color w:val="000000"/>
         </w:rPr>
-        <w:t>The observed non-monotonicity is consequential: a larger deterministic subset can fail after a smaller one passes. Common-budget decisions must therefore test one exact budget across every required panel and dependence scope rather than aggregate cell-specific minima. More broadly, benchmark subsets should be versioned, validated on later systems, and re-evaluated as tasks, harnesses, and system populations change. The result is not a recommended permanent subset of SWE-bench Verified, which is no longer a suitable frontier benchmark (OpenAI 2026). It is a reproducible warning about the limits of one-time benchmark compression and pointwise budget selection.</w:t>
+        <w:t xml:space="preserve">The implementation is available under the MIT License at </w:t>
+      </w:r>
+      <w:r>
+        <w:rPr>
+          <w:color w:val="000000"/>
+          <w:u w:val="single"/>
+        </w:rPr>
+        <w:t>https://github.com/coloursophia/coding-agent-benchmark-maintenance</w:t>
+      </w:r>
+      <w:r>
+        <w:rPr>
+          <w:color w:val="000000"/>
+        </w:rPr>
+        <w:t xml:space="preserve"> and in the versioned Zenodo archive (Cui et al. 2026). The replication bundle records the exact experiment commit, workflow run, artifact checksum, configuration, deterministic seed rules, exclusions, cluster mapping, and end-to-end commands.</w:t>
+      </w:r>
+    </w:p>
+    <w:p>
+      <w:pPr>
+        <w:pStyle w:val="Heading2"/>
+      </w:pPr>
+      <w:r>
+        <w:rPr>
+          <w:color w:val="000000"/>
+        </w:rPr>
+        <w:t>8.3 Use of generative AI</w:t>
+      </w:r>
+    </w:p>
+    <w:p>
+      <w:pPr/>
+      <w:r>
+        <w:rPr>
+          <w:color w:val="000000"/>
+        </w:rPr>
+        <w:t>OpenAI Codex assisted with implementing analysis code, checking calculations, and drafting and copyediting the manuscript. The human authors verified the code, results, citations, claims, and final text and retain responsibility for the work; the system is not an author.</w:t>
+      </w:r>
+    </w:p>
+    <w:p>
+      <w:pPr>
+        <w:pStyle w:val="Heading2"/>
+      </w:pPr>
+      <w:r>
+        <w:rPr>
+          <w:color w:val="000000"/>
+        </w:rPr>
+        <w:t>8.4 Ethics</w:t>
+      </w:r>
+    </w:p>
+    <w:p>
+      <w:pPr/>
+      <w:r>
+        <w:rPr>
+          <w:color w:val="000000"/>
+        </w:rPr>
+        <w:t>Ethics approval and participant consent are not applicable because the study analyzes public secondary benchmark artifacts and does not recruit or intervene with human participants.</w:t>
       </w:r>
     </w:p>
     <w:p>
@@ -9241,6 +9312,35 @@
         <w:rPr>
           <w:color w:val="000000"/>
         </w:rPr>
+        <w:t>9 Conclusion</w:t>
+      </w:r>
+    </w:p>
+    <w:p>
+      <w:pPr/>
+      <w:r>
+        <w:rPr>
+          <w:color w:val="000000"/>
+        </w:rPr>
+        <w:t>Task-set reduction for a coding-agent leaderboard must be evaluated as a future-ranking problem. In two temporal SWE-bench Verified panels, budgets that looked sufficient in a developmental cohort weakened under later standardized systems and related-system sensitivity. Under the primary and strict policies, uniform random, repository-stratified random, and entropy required all 500 tasks; the temporal-core procedure required 475. Under a common uncertainty definition with a standardized four-cell joint max-t band, the same 500/500/500/475 budgets remain. An unstandardized raw-deviation band instead forces all four to 500, demonstrating that the scaling and family of the band are part of the conclusion. Fixed selection and alternative cluster definitions further showed that neither task identity nor threshold crossing is invariant to the evaluation policy.</w:t>
+      </w:r>
+    </w:p>
+    <w:p>
+      <w:pPr/>
+      <w:r>
+        <w:rPr>
+          <w:color w:val="000000"/>
+        </w:rPr>
+        <w:t>The observed non-monotonicity is consequential: a larger deterministic subset can fail after a smaller one passes. Common-budget decisions must therefore test one exact budget across every required panel and dependence scope rather than aggregate cell-specific minima. More broadly, benchmark subsets should be versioned, validated on later systems, and re-evaluated as tasks, harnesses, and system populations change. The result is not a recommended permanent subset of SWE-bench Verified, which is no longer a suitable frontier benchmark (OpenAI 2026). It is a reproducible warning about the limits of one-time benchmark compression and pointwise budget selection.</w:t>
+      </w:r>
+    </w:p>
+    <w:p>
+      <w:pPr>
+        <w:pStyle w:val="Heading1"/>
+      </w:pPr>
+      <w:r>
+        <w:rPr>
+          <w:color w:val="000000"/>
+        </w:rPr>
         <w:t>References</w:t>
       </w:r>
     </w:p>
@@ -9350,6 +9450,24 @@
           <w:u w:val="single"/>
         </w:rPr>
         <w:t>https://doi.org/10.1162/rest.90.3.414</w:t>
+      </w:r>
+    </w:p>
+    <w:p>
+      <w:pPr>
+        <w:pStyle w:val="References"/>
+      </w:pPr>
+      <w:r>
+        <w:rPr>
+          <w:color w:val="000000"/>
+        </w:rPr>
+        <w:t xml:space="preserve">Cui X, Jia X, Zhang X, Li X (2026) Limits of task-set reduction in SWE-bench Verified: replication package, version 1.0.0. Zenodo [Software]. </w:t>
+      </w:r>
+      <w:r>
+        <w:rPr>
+          <w:color w:val="000000"/>
+          <w:u w:val="single"/>
+        </w:rPr>
+        <w:t>https://doi.org/10.5281/zenodo.22189000</w:t>
       </w:r>
     </w:p>
     <w:p>

</xml_diff>